<commit_message>
Update hdtv lấy địa chỉ mới
</commit_message>
<xml_diff>
--- a/RERPAPI/wwwroot/templates/(Mau)_HDTV.docx
+++ b/RERPAPI/wwwroot/templates/(Mau)_HDTV.docx
@@ -16,7 +16,6 @@
         <w:tc>
           <w:tcPr>
             <w:tcW w:w="4400" w:type="dxa"/>
-            <w:shd w:val="clear" w:color="auto" w:fill="auto"/>
           </w:tcPr>
           <w:p>
             <w:pPr>
@@ -71,7 +70,6 @@
         <w:tc>
           <w:tcPr>
             <w:tcW w:w="5245" w:type="dxa"/>
-            <w:shd w:val="clear" w:color="auto" w:fill="auto"/>
           </w:tcPr>
           <w:p>
             <w:pPr>
@@ -92,8 +90,8 @@
               </w:rPr>
               <w:t xml:space="preserve">CỘNG HÒA XÃ HỘI CHỦ NGHĨA VIỆT </w:t>
             </w:r>
-            <w:smartTag w:uri="urn:schemas-microsoft-com:office:smarttags" w:element="place">
-              <w:smartTag w:uri="urn:schemas-microsoft-com:office:smarttags" w:element="country-region">
+            <w:smartTag w:uri="urn:schemas-microsoft-com:office:smarttags" w:element="country-region">
+              <w:smartTag w:uri="urn:schemas-microsoft-com:office:smarttags" w:element="place">
                 <w:r>
                   <w:rPr>
                     <w:b/>
@@ -145,7 +143,6 @@
         <w:tc>
           <w:tcPr>
             <w:tcW w:w="4400" w:type="dxa"/>
-            <w:shd w:val="clear" w:color="auto" w:fill="auto"/>
           </w:tcPr>
           <w:p>
             <w:pPr>
@@ -156,6 +153,7 @@
                 <w:spacing w:val="-2"/>
               </w:rPr>
             </w:pPr>
+            <w:proofErr w:type="gramStart"/>
             <w:r>
               <w:rPr>
                 <w:spacing w:val="-2"/>
@@ -182,6 +180,7 @@
               </w:rPr>
               <w:t>#</w:t>
             </w:r>
+            <w:proofErr w:type="gramEnd"/>
             <w:r>
               <w:rPr>
                 <w:color w:val="000000"/>
@@ -194,7 +193,6 @@
         <w:tc>
           <w:tcPr>
             <w:tcW w:w="5245" w:type="dxa"/>
-            <w:shd w:val="clear" w:color="auto" w:fill="auto"/>
           </w:tcPr>
           <w:p>
             <w:pPr>
@@ -369,8 +367,21 @@
           <w:szCs w:val="26"/>
           <w:shd w:val="clear" w:color="auto" w:fill="FFFFFF"/>
         </w:rPr>
-        <w:t xml:space="preserve"> và các văn bản sửa đổi, bổ sung;</w:t>
-      </w:r>
+        <w:t xml:space="preserve"> và các văn bản sửa đổi, bổ </w:t>
+      </w:r>
+      <w:proofErr w:type="gramStart"/>
+      <w:r>
+        <w:rPr>
+          <w:i/>
+          <w:iCs/>
+          <w:color w:val="000000"/>
+          <w:sz w:val="26"/>
+          <w:szCs w:val="26"/>
+          <w:shd w:val="clear" w:color="auto" w:fill="FFFFFF"/>
+        </w:rPr>
+        <w:t>sung;</w:t>
+      </w:r>
+      <w:proofErr w:type="gramEnd"/>
     </w:p>
     <w:p>
       <w:pPr>
@@ -755,7 +766,6 @@
         <w:tc>
           <w:tcPr>
             <w:tcW w:w="2093" w:type="dxa"/>
-            <w:shd w:val="clear" w:color="auto" w:fill="auto"/>
           </w:tcPr>
           <w:p>
             <w:pPr>
@@ -786,7 +796,6 @@
           <w:tcPr>
             <w:tcW w:w="7478" w:type="dxa"/>
             <w:gridSpan w:val="3"/>
-            <w:shd w:val="clear" w:color="auto" w:fill="auto"/>
           </w:tcPr>
           <w:p>
             <w:pPr>
@@ -834,7 +843,6 @@
         <w:tc>
           <w:tcPr>
             <w:tcW w:w="2093" w:type="dxa"/>
-            <w:shd w:val="clear" w:color="auto" w:fill="auto"/>
           </w:tcPr>
           <w:p>
             <w:pPr>
@@ -865,7 +873,6 @@
           <w:tcPr>
             <w:tcW w:w="7478" w:type="dxa"/>
             <w:gridSpan w:val="3"/>
-            <w:shd w:val="clear" w:color="auto" w:fill="auto"/>
           </w:tcPr>
           <w:p>
             <w:pPr>
@@ -895,17 +902,8 @@
               <w:rPr>
                 <w:sz w:val="26"/>
                 <w:szCs w:val="26"/>
-                <w:lang w:val="fr-FR"/>
               </w:rPr>
-              <w:t>Nhà A52, TT10, Khu đô thị mới Văn Quán, Phường Văn Quán, Quận Hà Đông</w:t>
-            </w:r>
-            <w:r>
-              <w:rPr>
-                <w:sz w:val="26"/>
-                <w:szCs w:val="26"/>
-                <w:lang w:val="fr-FR"/>
-              </w:rPr>
-              <w:t>, TP.Hà Nội, Việt Nam</w:t>
+              <w:t>#AddCom</w:t>
             </w:r>
           </w:p>
         </w:tc>
@@ -914,7 +912,6 @@
         <w:tc>
           <w:tcPr>
             <w:tcW w:w="2093" w:type="dxa"/>
-            <w:shd w:val="clear" w:color="auto" w:fill="auto"/>
           </w:tcPr>
           <w:p>
             <w:pPr>
@@ -945,7 +942,6 @@
           <w:tcPr>
             <w:tcW w:w="7478" w:type="dxa"/>
             <w:gridSpan w:val="3"/>
-            <w:shd w:val="clear" w:color="auto" w:fill="auto"/>
           </w:tcPr>
           <w:p>
             <w:pPr>
@@ -985,7 +981,6 @@
         <w:tc>
           <w:tcPr>
             <w:tcW w:w="2093" w:type="dxa"/>
-            <w:shd w:val="clear" w:color="auto" w:fill="auto"/>
           </w:tcPr>
           <w:p>
             <w:pPr>
@@ -1015,7 +1010,6 @@
         <w:tc>
           <w:tcPr>
             <w:tcW w:w="4252" w:type="dxa"/>
-            <w:shd w:val="clear" w:color="auto" w:fill="auto"/>
           </w:tcPr>
           <w:p>
             <w:pPr>
@@ -1052,7 +1046,6 @@
         <w:tc>
           <w:tcPr>
             <w:tcW w:w="1134" w:type="dxa"/>
-            <w:shd w:val="clear" w:color="auto" w:fill="auto"/>
           </w:tcPr>
           <w:p>
             <w:pPr>
@@ -1082,7 +1075,6 @@
         <w:tc>
           <w:tcPr>
             <w:tcW w:w="2092" w:type="dxa"/>
-            <w:shd w:val="clear" w:color="auto" w:fill="auto"/>
           </w:tcPr>
           <w:p>
             <w:pPr>
@@ -1192,8 +1184,9 @@
           <w:szCs w:val="26"/>
           <w:lang w:val="fr-FR"/>
         </w:rPr>
-        <w:t xml:space="preserve"> (NGƯỜI LAO ĐỘNG)</w:t>
-      </w:r>
+        <w:t xml:space="preserve"> (NGƯỜI LAO ĐỘNG</w:t>
+      </w:r>
+      <w:proofErr w:type="gramStart"/>
       <w:r>
         <w:rPr>
           <w:b/>
@@ -1202,7 +1195,28 @@
           <w:szCs w:val="26"/>
           <w:lang w:val="fr-FR"/>
         </w:rPr>
-        <w:t xml:space="preserve">: </w:t>
+        <w:t>)</w:t>
+      </w:r>
+      <w:r>
+        <w:rPr>
+          <w:b/>
+          <w:bCs/>
+          <w:sz w:val="26"/>
+          <w:szCs w:val="26"/>
+          <w:lang w:val="fr-FR"/>
+        </w:rPr>
+        <w:t>:</w:t>
+      </w:r>
+      <w:proofErr w:type="gramEnd"/>
+      <w:r>
+        <w:rPr>
+          <w:b/>
+          <w:bCs/>
+          <w:sz w:val="26"/>
+          <w:szCs w:val="26"/>
+          <w:lang w:val="fr-FR"/>
+        </w:rPr>
+        <w:t xml:space="preserve"> </w:t>
       </w:r>
     </w:p>
     <w:tbl>
@@ -1220,7 +1234,6 @@
         <w:tc>
           <w:tcPr>
             <w:tcW w:w="2126" w:type="dxa"/>
-            <w:shd w:val="clear" w:color="auto" w:fill="auto"/>
           </w:tcPr>
           <w:p>
             <w:pPr>
@@ -1253,7 +1266,6 @@
         <w:tc>
           <w:tcPr>
             <w:tcW w:w="4265" w:type="dxa"/>
-            <w:shd w:val="clear" w:color="auto" w:fill="auto"/>
           </w:tcPr>
           <w:p>
             <w:pPr>
@@ -1295,7 +1307,6 @@
         <w:tc>
           <w:tcPr>
             <w:tcW w:w="1261" w:type="dxa"/>
-            <w:shd w:val="clear" w:color="auto" w:fill="auto"/>
           </w:tcPr>
           <w:p>
             <w:pPr>
@@ -1328,7 +1339,6 @@
         <w:tc>
           <w:tcPr>
             <w:tcW w:w="1808" w:type="dxa"/>
-            <w:shd w:val="clear" w:color="auto" w:fill="auto"/>
           </w:tcPr>
           <w:p>
             <w:pPr>
@@ -1372,7 +1382,6 @@
         <w:tc>
           <w:tcPr>
             <w:tcW w:w="2126" w:type="dxa"/>
-            <w:shd w:val="clear" w:color="auto" w:fill="auto"/>
           </w:tcPr>
           <w:p>
             <w:pPr>
@@ -1405,7 +1414,6 @@
         <w:tc>
           <w:tcPr>
             <w:tcW w:w="4265" w:type="dxa"/>
-            <w:shd w:val="clear" w:color="auto" w:fill="auto"/>
           </w:tcPr>
           <w:p>
             <w:pPr>
@@ -1446,7 +1454,6 @@
         <w:tc>
           <w:tcPr>
             <w:tcW w:w="1261" w:type="dxa"/>
-            <w:shd w:val="clear" w:color="auto" w:fill="auto"/>
           </w:tcPr>
           <w:p>
             <w:pPr>
@@ -1479,7 +1486,6 @@
         <w:tc>
           <w:tcPr>
             <w:tcW w:w="1808" w:type="dxa"/>
-            <w:shd w:val="clear" w:color="auto" w:fill="auto"/>
           </w:tcPr>
           <w:p>
             <w:pPr>
@@ -1522,7 +1528,6 @@
         <w:tc>
           <w:tcPr>
             <w:tcW w:w="2126" w:type="dxa"/>
-            <w:shd w:val="clear" w:color="auto" w:fill="auto"/>
           </w:tcPr>
           <w:p>
             <w:pPr>
@@ -1555,7 +1560,6 @@
         <w:tc>
           <w:tcPr>
             <w:tcW w:w="4265" w:type="dxa"/>
-            <w:shd w:val="clear" w:color="auto" w:fill="auto"/>
           </w:tcPr>
           <w:p>
             <w:pPr>
@@ -1596,7 +1600,6 @@
         <w:tc>
           <w:tcPr>
             <w:tcW w:w="1261" w:type="dxa"/>
-            <w:shd w:val="clear" w:color="auto" w:fill="auto"/>
           </w:tcPr>
           <w:p>
             <w:pPr>
@@ -1629,7 +1632,6 @@
         <w:tc>
           <w:tcPr>
             <w:tcW w:w="1808" w:type="dxa"/>
-            <w:shd w:val="clear" w:color="auto" w:fill="auto"/>
           </w:tcPr>
           <w:p>
             <w:pPr>
@@ -1672,7 +1674,6 @@
         <w:tc>
           <w:tcPr>
             <w:tcW w:w="2126" w:type="dxa"/>
-            <w:shd w:val="clear" w:color="auto" w:fill="auto"/>
           </w:tcPr>
           <w:p>
             <w:pPr>
@@ -1706,7 +1707,6 @@
           <w:tcPr>
             <w:tcW w:w="7334" w:type="dxa"/>
             <w:gridSpan w:val="3"/>
-            <w:shd w:val="clear" w:color="auto" w:fill="auto"/>
           </w:tcPr>
           <w:p>
             <w:pPr>
@@ -1757,7 +1757,6 @@
         <w:tc>
           <w:tcPr>
             <w:tcW w:w="2126" w:type="dxa"/>
-            <w:shd w:val="clear" w:color="auto" w:fill="auto"/>
           </w:tcPr>
           <w:p>
             <w:pPr>
@@ -1791,7 +1790,6 @@
           <w:tcPr>
             <w:tcW w:w="7336" w:type="dxa"/>
             <w:gridSpan w:val="3"/>
-            <w:shd w:val="clear" w:color="auto" w:fill="auto"/>
           </w:tcPr>
           <w:p>
             <w:pPr>
@@ -1834,7 +1832,6 @@
         <w:tc>
           <w:tcPr>
             <w:tcW w:w="2126" w:type="dxa"/>
-            <w:shd w:val="clear" w:color="auto" w:fill="auto"/>
           </w:tcPr>
           <w:p>
             <w:pPr>
@@ -1868,7 +1865,6 @@
           <w:tcPr>
             <w:tcW w:w="7334" w:type="dxa"/>
             <w:gridSpan w:val="3"/>
-            <w:shd w:val="clear" w:color="auto" w:fill="auto"/>
           </w:tcPr>
           <w:p>
             <w:pPr>
@@ -2007,8 +2003,19 @@
           <w:szCs w:val="26"/>
           <w:lang w:val="fr-FR"/>
         </w:rPr>
-        <w:t xml:space="preserve"> điều khoản sau đây:</w:t>
-      </w:r>
+        <w:t xml:space="preserve"> điều khoản sau </w:t>
+      </w:r>
+      <w:proofErr w:type="gramStart"/>
+      <w:r>
+        <w:rPr>
+          <w:i/>
+          <w:sz w:val="26"/>
+          <w:szCs w:val="26"/>
+          <w:lang w:val="fr-FR"/>
+        </w:rPr>
+        <w:t>đây:</w:t>
+      </w:r>
+      <w:proofErr w:type="gramEnd"/>
     </w:p>
     <w:p>
       <w:pPr>
@@ -2033,7 +2040,29 @@
           <w:szCs w:val="26"/>
           <w:lang w:val="fr-FR"/>
         </w:rPr>
-        <w:t>Điều 1: Điều khoản chung</w:t>
+        <w:t xml:space="preserve">Điều </w:t>
+      </w:r>
+      <w:proofErr w:type="gramStart"/>
+      <w:r>
+        <w:rPr>
+          <w:b/>
+          <w:color w:val="000000"/>
+          <w:sz w:val="26"/>
+          <w:szCs w:val="26"/>
+          <w:lang w:val="fr-FR"/>
+        </w:rPr>
+        <w:t>1:</w:t>
+      </w:r>
+      <w:proofErr w:type="gramEnd"/>
+      <w:r>
+        <w:rPr>
+          <w:b/>
+          <w:color w:val="000000"/>
+          <w:sz w:val="26"/>
+          <w:szCs w:val="26"/>
+          <w:lang w:val="fr-FR"/>
+        </w:rPr>
+        <w:t xml:space="preserve"> Điều khoản chung</w:t>
       </w:r>
     </w:p>
     <w:p>
@@ -2508,7 +2537,27 @@
           <w:szCs w:val="26"/>
           <w:lang w:val="fr-FR"/>
         </w:rPr>
-        <w:t xml:space="preserve">Điều 2: </w:t>
+        <w:t xml:space="preserve">Điều </w:t>
+      </w:r>
+      <w:proofErr w:type="gramStart"/>
+      <w:r>
+        <w:rPr>
+          <w:b/>
+          <w:sz w:val="26"/>
+          <w:szCs w:val="26"/>
+          <w:lang w:val="fr-FR"/>
+        </w:rPr>
+        <w:t>2:</w:t>
+      </w:r>
+      <w:proofErr w:type="gramEnd"/>
+      <w:r>
+        <w:rPr>
+          <w:b/>
+          <w:sz w:val="26"/>
+          <w:szCs w:val="26"/>
+          <w:lang w:val="fr-FR"/>
+        </w:rPr>
+        <w:t xml:space="preserve"> </w:t>
       </w:r>
       <w:r>
         <w:rPr>
@@ -2545,15 +2594,33 @@
           <w:szCs w:val="26"/>
           <w:lang w:val="fr-FR"/>
         </w:rPr>
-        <w:t>Thời gian làm việc</w:t>
-      </w:r>
+        <w:t xml:space="preserve">Thời gian làm </w:t>
+      </w:r>
+      <w:proofErr w:type="gramStart"/>
       <w:r>
         <w:rPr>
           <w:sz w:val="26"/>
           <w:szCs w:val="26"/>
           <w:lang w:val="fr-FR"/>
         </w:rPr>
-        <w:t xml:space="preserve">: </w:t>
+        <w:t>việc</w:t>
+      </w:r>
+      <w:r>
+        <w:rPr>
+          <w:sz w:val="26"/>
+          <w:szCs w:val="26"/>
+          <w:lang w:val="fr-FR"/>
+        </w:rPr>
+        <w:t>:</w:t>
+      </w:r>
+      <w:proofErr w:type="gramEnd"/>
+      <w:r>
+        <w:rPr>
+          <w:sz w:val="26"/>
+          <w:szCs w:val="26"/>
+          <w:lang w:val="fr-FR"/>
+        </w:rPr>
+        <w:t xml:space="preserve"> </w:t>
       </w:r>
       <w:r>
         <w:rPr>
@@ -2623,15 +2690,33 @@
           <w:szCs w:val="26"/>
           <w:lang w:val="fr-FR"/>
         </w:rPr>
-        <w:t>công cụ lao động</w:t>
-      </w:r>
+        <w:t xml:space="preserve">công cụ lao </w:t>
+      </w:r>
+      <w:proofErr w:type="gramStart"/>
       <w:r>
         <w:rPr>
           <w:sz w:val="26"/>
           <w:szCs w:val="26"/>
           <w:lang w:val="fr-FR"/>
         </w:rPr>
-        <w:t xml:space="preserve">: Theo </w:t>
+        <w:t>động</w:t>
+      </w:r>
+      <w:r>
+        <w:rPr>
+          <w:sz w:val="26"/>
+          <w:szCs w:val="26"/>
+          <w:lang w:val="fr-FR"/>
+        </w:rPr>
+        <w:t>:</w:t>
+      </w:r>
+      <w:proofErr w:type="gramEnd"/>
+      <w:r>
+        <w:rPr>
+          <w:sz w:val="26"/>
+          <w:szCs w:val="26"/>
+          <w:lang w:val="fr-FR"/>
+        </w:rPr>
+        <w:t xml:space="preserve"> Theo </w:t>
       </w:r>
       <w:r>
         <w:rPr>
@@ -2675,7 +2760,25 @@
           <w:szCs w:val="26"/>
           <w:lang w:val="fr-FR"/>
         </w:rPr>
-        <w:t xml:space="preserve">Trang bị bảo hộ lao động cho Người lao động: Theo quy định hiện hành của </w:t>
+        <w:t xml:space="preserve">Trang bị bảo hộ lao động cho Người lao </w:t>
+      </w:r>
+      <w:proofErr w:type="gramStart"/>
+      <w:r>
+        <w:rPr>
+          <w:sz w:val="26"/>
+          <w:szCs w:val="26"/>
+          <w:lang w:val="fr-FR"/>
+        </w:rPr>
+        <w:t>động:</w:t>
+      </w:r>
+      <w:proofErr w:type="gramEnd"/>
+      <w:r>
+        <w:rPr>
+          <w:sz w:val="26"/>
+          <w:szCs w:val="26"/>
+          <w:lang w:val="fr-FR"/>
+        </w:rPr>
+        <w:t xml:space="preserve"> Theo quy định hiện hành của </w:t>
       </w:r>
       <w:r>
         <w:rPr>
@@ -2715,7 +2818,27 @@
           <w:szCs w:val="26"/>
           <w:lang w:val="fr-FR"/>
         </w:rPr>
-        <w:t xml:space="preserve">Điều 3: </w:t>
+        <w:t xml:space="preserve">Điều </w:t>
+      </w:r>
+      <w:proofErr w:type="gramStart"/>
+      <w:r>
+        <w:rPr>
+          <w:b/>
+          <w:sz w:val="26"/>
+          <w:szCs w:val="26"/>
+          <w:lang w:val="fr-FR"/>
+        </w:rPr>
+        <w:t>3:</w:t>
+      </w:r>
+      <w:proofErr w:type="gramEnd"/>
+      <w:r>
+        <w:rPr>
+          <w:b/>
+          <w:sz w:val="26"/>
+          <w:szCs w:val="26"/>
+          <w:lang w:val="fr-FR"/>
+        </w:rPr>
+        <w:t xml:space="preserve"> </w:t>
       </w:r>
       <w:r>
         <w:rPr>
@@ -2762,8 +2885,9 @@
           <w:szCs w:val="26"/>
           <w:lang w:val="fr-FR"/>
         </w:rPr>
-        <w:t>Người lao động có các quyền như sau</w:t>
-      </w:r>
+        <w:t xml:space="preserve">Người lao động có các quyền như </w:t>
+      </w:r>
+      <w:proofErr w:type="gramStart"/>
       <w:r>
         <w:rPr>
           <w:b/>
@@ -2771,8 +2895,18 @@
           <w:szCs w:val="26"/>
           <w:lang w:val="fr-FR"/>
         </w:rPr>
+        <w:t>sau</w:t>
+      </w:r>
+      <w:r>
+        <w:rPr>
+          <w:b/>
+          <w:sz w:val="26"/>
+          <w:szCs w:val="26"/>
+          <w:lang w:val="fr-FR"/>
+        </w:rPr>
         <w:t>:</w:t>
       </w:r>
+      <w:proofErr w:type="gramEnd"/>
     </w:p>
     <w:p>
       <w:pPr>
@@ -2803,8 +2937,9 @@
           <w:szCs w:val="26"/>
           <w:lang w:val="fr-FR"/>
         </w:rPr>
-        <w:t xml:space="preserve">Phương tiện đi lại làm việc: </w:t>
-      </w:r>
+        <w:t xml:space="preserve">Phương tiện đi lại làm </w:t>
+      </w:r>
+      <w:proofErr w:type="gramStart"/>
       <w:r>
         <w:rPr>
           <w:bCs/>
@@ -2813,8 +2948,9 @@
           <w:szCs w:val="26"/>
           <w:lang w:val="fr-FR"/>
         </w:rPr>
-        <w:t>Người lao động tự túc</w:t>
-      </w:r>
+        <w:t>việc:</w:t>
+      </w:r>
+      <w:proofErr w:type="gramEnd"/>
       <w:r>
         <w:rPr>
           <w:bCs/>
@@ -2823,8 +2959,40 @@
           <w:szCs w:val="26"/>
           <w:lang w:val="fr-FR"/>
         </w:rPr>
+        <w:t xml:space="preserve"> </w:t>
+      </w:r>
+      <w:r>
+        <w:rPr>
+          <w:bCs/>
+          <w:color w:val="000000"/>
+          <w:sz w:val="26"/>
+          <w:szCs w:val="26"/>
+          <w:lang w:val="fr-FR"/>
+        </w:rPr>
+        <w:t xml:space="preserve">Người lao động tự </w:t>
+      </w:r>
+      <w:proofErr w:type="gramStart"/>
+      <w:r>
+        <w:rPr>
+          <w:bCs/>
+          <w:color w:val="000000"/>
+          <w:sz w:val="26"/>
+          <w:szCs w:val="26"/>
+          <w:lang w:val="fr-FR"/>
+        </w:rPr>
+        <w:t>túc</w:t>
+      </w:r>
+      <w:r>
+        <w:rPr>
+          <w:bCs/>
+          <w:color w:val="000000"/>
+          <w:sz w:val="26"/>
+          <w:szCs w:val="26"/>
+          <w:lang w:val="fr-FR"/>
+        </w:rPr>
         <w:t>;</w:t>
       </w:r>
+      <w:proofErr w:type="gramEnd"/>
     </w:p>
     <w:p>
       <w:pPr>
@@ -2888,8 +3056,19 @@
           <w:szCs w:val="26"/>
           <w:lang w:val="fr-FR"/>
         </w:rPr>
-        <w:t xml:space="preserve"> là:</w:t>
-      </w:r>
+        <w:t xml:space="preserve"> </w:t>
+      </w:r>
+      <w:proofErr w:type="gramStart"/>
+      <w:r>
+        <w:rPr>
+          <w:bCs/>
+          <w:sz w:val="26"/>
+          <w:szCs w:val="26"/>
+          <w:lang w:val="fr-FR"/>
+        </w:rPr>
+        <w:t>là:</w:t>
+      </w:r>
+      <w:proofErr w:type="gramEnd"/>
       <w:r>
         <w:rPr>
           <w:bCs/>
@@ -3077,6 +3256,7 @@
         </w:rPr>
         <w:t xml:space="preserve">à các quy định khác của </w:t>
       </w:r>
+      <w:proofErr w:type="gramStart"/>
       <w:r>
         <w:rPr>
           <w:bCs/>
@@ -3093,6 +3273,7 @@
         </w:rPr>
         <w:t>;</w:t>
       </w:r>
+      <w:proofErr w:type="gramEnd"/>
     </w:p>
     <w:p>
       <w:pPr>
@@ -3159,16 +3340,26 @@
           <w:sz w:val="26"/>
           <w:szCs w:val="26"/>
         </w:rPr>
-        <w:t>Chuyển khoản hoặc tiền mặt</w:t>
-      </w:r>
+        <w:t xml:space="preserve">Chuyển khoản hoặc tiền </w:t>
+      </w:r>
+      <w:proofErr w:type="gramStart"/>
       <w:r>
         <w:rPr>
           <w:bCs/>
           <w:sz w:val="26"/>
           <w:szCs w:val="26"/>
         </w:rPr>
+        <w:t>mặt</w:t>
+      </w:r>
+      <w:r>
+        <w:rPr>
+          <w:bCs/>
+          <w:sz w:val="26"/>
+          <w:szCs w:val="26"/>
+        </w:rPr>
         <w:t>;</w:t>
       </w:r>
+      <w:proofErr w:type="gramEnd"/>
     </w:p>
     <w:p>
       <w:pPr>
@@ -3251,16 +3442,26 @@
           <w:sz w:val="26"/>
           <w:szCs w:val="26"/>
         </w:rPr>
-        <w:t xml:space="preserve"> trong từng thời kỳ</w:t>
-      </w:r>
+        <w:t xml:space="preserve"> trong từng thời </w:t>
+      </w:r>
+      <w:proofErr w:type="gramStart"/>
       <w:r>
         <w:rPr>
           <w:bCs/>
           <w:sz w:val="26"/>
           <w:szCs w:val="26"/>
         </w:rPr>
+        <w:t>kỳ</w:t>
+      </w:r>
+      <w:r>
+        <w:rPr>
+          <w:bCs/>
+          <w:sz w:val="26"/>
+          <w:szCs w:val="26"/>
+        </w:rPr>
         <w:t>;</w:t>
       </w:r>
+      <w:proofErr w:type="gramEnd"/>
     </w:p>
     <w:p>
       <w:pPr>
@@ -3369,6 +3570,7 @@
         </w:rPr>
         <w:t xml:space="preserve">à các quy định khác của </w:t>
       </w:r>
+      <w:proofErr w:type="gramStart"/>
       <w:r>
         <w:rPr>
           <w:bCs/>
@@ -3385,6 +3587,7 @@
         </w:rPr>
         <w:t>;</w:t>
       </w:r>
+      <w:proofErr w:type="gramEnd"/>
     </w:p>
     <w:p>
       <w:pPr>
@@ -3529,7 +3732,15 @@
           <w:sz w:val="26"/>
           <w:szCs w:val="26"/>
         </w:rPr>
-        <w:t>Hoàn thành những công việc đã cam kết trong Hợp đồng này</w:t>
+        <w:t xml:space="preserve">Hoàn thành những công việc đã cam kết trong Hợp đồng </w:t>
+      </w:r>
+      <w:proofErr w:type="gramStart"/>
+      <w:r>
+        <w:rPr>
+          <w:sz w:val="26"/>
+          <w:szCs w:val="26"/>
+        </w:rPr>
+        <w:t>này</w:t>
       </w:r>
       <w:r>
         <w:rPr>
@@ -3538,6 +3749,7 @@
         </w:rPr>
         <w:t>;</w:t>
       </w:r>
+      <w:proofErr w:type="gramEnd"/>
     </w:p>
     <w:p>
       <w:pPr>
@@ -3558,8 +3770,17 @@
           <w:sz w:val="26"/>
           <w:szCs w:val="26"/>
         </w:rPr>
-        <w:t>Đền bù thiệt hại do lỗi cá nhân gây ra sau khi có Quyết định xử lý kỷ luật của Hội đồng kỷ luật hoặc bản án, quyết định của Toà án, cơ quan có thẩm quyền;</w:t>
-      </w:r>
+        <w:t xml:space="preserve">Đền bù thiệt hại do lỗi cá nhân gây ra sau khi có Quyết định xử lý kỷ luật của Hội đồng kỷ luật hoặc bản án, quyết định của Toà án, cơ quan có thẩm </w:t>
+      </w:r>
+      <w:proofErr w:type="gramStart"/>
+      <w:r>
+        <w:rPr>
+          <w:sz w:val="26"/>
+          <w:szCs w:val="26"/>
+        </w:rPr>
+        <w:t>quyền;</w:t>
+      </w:r>
+      <w:proofErr w:type="gramEnd"/>
     </w:p>
     <w:p>
       <w:pPr>
@@ -3590,8 +3811,18 @@
           <w:sz w:val="26"/>
           <w:szCs w:val="26"/>
         </w:rPr>
-        <w:t>ng hiệu hay kinh tế của Công ty;</w:t>
-      </w:r>
+        <w:t xml:space="preserve">ng hiệu hay kinh tế của Công </w:t>
+      </w:r>
+      <w:proofErr w:type="gramStart"/>
+      <w:r>
+        <w:rPr>
+          <w:rFonts w:ascii="Times New Roman" w:hAnsi="Times New Roman"/>
+          <w:sz w:val="26"/>
+          <w:szCs w:val="26"/>
+        </w:rPr>
+        <w:t>ty;</w:t>
+      </w:r>
+      <w:proofErr w:type="gramEnd"/>
       <w:r>
         <w:rPr>
           <w:rFonts w:ascii="Times New Roman" w:hAnsi="Times New Roman"/>
@@ -3640,6 +3871,7 @@
         </w:rPr>
         <w:t xml:space="preserve">hà </w:t>
       </w:r>
+      <w:proofErr w:type="gramStart"/>
       <w:r>
         <w:rPr>
           <w:rFonts w:ascii="Times New Roman" w:hAnsi="Times New Roman"/>
@@ -3658,6 +3890,7 @@
         </w:rPr>
         <w:t>;</w:t>
       </w:r>
+      <w:proofErr w:type="gramEnd"/>
       <w:r>
         <w:rPr>
           <w:rFonts w:ascii="Times New Roman" w:hAnsi="Times New Roman"/>
@@ -3778,16 +4011,26 @@
           <w:sz w:val="26"/>
           <w:szCs w:val="26"/>
         </w:rPr>
-        <w:t xml:space="preserve"> RTC</w:t>
-      </w:r>
+        <w:t xml:space="preserve"> </w:t>
+      </w:r>
+      <w:proofErr w:type="gramStart"/>
       <w:r>
         <w:rPr>
           <w:rFonts w:ascii="Times New Roman" w:hAnsi="Times New Roman"/>
           <w:sz w:val="26"/>
           <w:szCs w:val="26"/>
         </w:rPr>
+        <w:t>RTC</w:t>
+      </w:r>
+      <w:r>
+        <w:rPr>
+          <w:rFonts w:ascii="Times New Roman" w:hAnsi="Times New Roman"/>
+          <w:sz w:val="26"/>
+          <w:szCs w:val="26"/>
+        </w:rPr>
         <w:t>;</w:t>
       </w:r>
+      <w:proofErr w:type="gramEnd"/>
     </w:p>
     <w:p>
       <w:pPr>
@@ -3834,7 +4077,27 @@
           <w:szCs w:val="26"/>
           <w:lang w:val="fr-FR"/>
         </w:rPr>
-        <w:t xml:space="preserve">Điều 4: </w:t>
+        <w:t xml:space="preserve">Điều </w:t>
+      </w:r>
+      <w:proofErr w:type="gramStart"/>
+      <w:r>
+        <w:rPr>
+          <w:b/>
+          <w:sz w:val="26"/>
+          <w:szCs w:val="26"/>
+          <w:lang w:val="fr-FR"/>
+        </w:rPr>
+        <w:t>4:</w:t>
+      </w:r>
+      <w:proofErr w:type="gramEnd"/>
+      <w:r>
+        <w:rPr>
+          <w:b/>
+          <w:sz w:val="26"/>
+          <w:szCs w:val="26"/>
+          <w:lang w:val="fr-FR"/>
+        </w:rPr>
+        <w:t xml:space="preserve"> </w:t>
       </w:r>
       <w:r>
         <w:rPr>
@@ -3887,8 +4150,19 @@
           <w:szCs w:val="26"/>
           <w:lang w:val="fr-FR"/>
         </w:rPr>
-        <w:t xml:space="preserve"> có các quyền như sau:</w:t>
-      </w:r>
+        <w:t xml:space="preserve"> có các quyền như </w:t>
+      </w:r>
+      <w:proofErr w:type="gramStart"/>
+      <w:r>
+        <w:rPr>
+          <w:b/>
+          <w:sz w:val="26"/>
+          <w:szCs w:val="26"/>
+          <w:lang w:val="fr-FR"/>
+        </w:rPr>
+        <w:t>sau:</w:t>
+      </w:r>
+      <w:proofErr w:type="gramEnd"/>
     </w:p>
     <w:p>
       <w:pPr>
@@ -4171,7 +4445,27 @@
           <w:szCs w:val="26"/>
           <w:lang w:val="fr-FR"/>
         </w:rPr>
-        <w:t xml:space="preserve">Điều 5: </w:t>
+        <w:t xml:space="preserve">Điều </w:t>
+      </w:r>
+      <w:proofErr w:type="gramStart"/>
+      <w:r>
+        <w:rPr>
+          <w:b/>
+          <w:sz w:val="26"/>
+          <w:szCs w:val="26"/>
+          <w:lang w:val="fr-FR"/>
+        </w:rPr>
+        <w:t>5:</w:t>
+      </w:r>
+      <w:proofErr w:type="gramEnd"/>
+      <w:r>
+        <w:rPr>
+          <w:b/>
+          <w:sz w:val="26"/>
+          <w:szCs w:val="26"/>
+          <w:lang w:val="fr-FR"/>
+        </w:rPr>
+        <w:t xml:space="preserve"> </w:t>
       </w:r>
       <w:r>
         <w:rPr>
@@ -4213,8 +4507,18 @@
           <w:szCs w:val="26"/>
           <w:lang w:val="fr-FR"/>
         </w:rPr>
-        <w:t xml:space="preserve"> tranh chấp, hai bên thống nhất giải quyết bằng biện pháp thương lượng trực tiếp, thông qua hòa giải trên nguyên tắc bình đẳng, hợp tác, công khai. Trường hợp không thể hòa giải được, các bên có quyền đề nghị Tòa án có thẩm quyền giải quyết;</w:t>
-      </w:r>
+        <w:t xml:space="preserve"> tranh chấp, hai bên thống nhất giải quyết bằng biện pháp thương lượng trực tiếp, thông qua hòa giải trên nguyên tắc bình đẳng, hợp tác, công khai. Trường hợp không thể hòa giải được, các bên có quyền đề nghị Tòa án có thẩm quyền giải </w:t>
+      </w:r>
+      <w:proofErr w:type="gramStart"/>
+      <w:r>
+        <w:rPr>
+          <w:sz w:val="26"/>
+          <w:szCs w:val="26"/>
+          <w:lang w:val="fr-FR"/>
+        </w:rPr>
+        <w:t>quyết;</w:t>
+      </w:r>
+      <w:proofErr w:type="gramEnd"/>
     </w:p>
     <w:p>
       <w:pPr>
@@ -4431,7 +4735,6 @@
         <w:tc>
           <w:tcPr>
             <w:tcW w:w="5084" w:type="dxa"/>
-            <w:shd w:val="clear" w:color="auto" w:fill="auto"/>
           </w:tcPr>
           <w:p>
             <w:pPr>
@@ -4493,7 +4796,6 @@
         <w:tc>
           <w:tcPr>
             <w:tcW w:w="4515" w:type="dxa"/>
-            <w:shd w:val="clear" w:color="auto" w:fill="auto"/>
           </w:tcPr>
           <w:p>
             <w:pPr>
@@ -9734,7 +10036,6 @@
   <w:style w:type="character" w:default="1" w:styleId="DefaultParagraphFont">
     <w:name w:val="Default Paragraph Font"/>
     <w:uiPriority w:val="1"/>
-    <w:semiHidden/>
     <w:unhideWhenUsed/>
   </w:style>
   <w:style w:type="table" w:default="1" w:styleId="TableNormal">

</xml_diff>